<commit_message>
Si el coste es manual que las unidades no las sume para calcular el coste por unidad
</commit_message>
<xml_diff>
--- a/Docs/Solherbs – Costes adicionales. Funcionamiento de la dll.docx
+++ b/Docs/Solherbs – Costes adicionales. Funcionamiento de la dll.docx
@@ -36,6 +36,9 @@
         </w:tabs>
       </w:pPr>
       <w:r>
+        <w:rPr>
+          <w:noProof/>
+        </w:rPr>
         <w:drawing>
           <wp:inline distT="0" distB="0" distL="0" distR="0" wp14:anchorId="50266704" wp14:editId="3D18E158">
             <wp:extent cx="6120765" cy="2068830"/>
@@ -80,15 +83,7 @@
         </w:tabs>
       </w:pPr>
       <w:r>
-        <w:t xml:space="preserve">Estos costes pueden ser sumados los costes de las líneas del albarán, o no, dependiendo de si está marcado el </w:t>
-      </w:r>
-      <w:proofErr w:type="spellStart"/>
-      <w:r>
-        <w:t>check</w:t>
-      </w:r>
-      <w:proofErr w:type="spellEnd"/>
-      <w:r>
-        <w:t xml:space="preserve"> de sumar o no.</w:t>
+        <w:t>Estos costes pueden ser sumados los costes de las líneas del albarán, o no, dependiendo de si está marcado el check de sumar o no.</w:t>
       </w:r>
     </w:p>
     <w:p>
@@ -98,15 +93,7 @@
         </w:tabs>
       </w:pPr>
       <w:r>
-        <w:t xml:space="preserve">Cuando se guarda el albarán de venta, se suman los costes indicados en esta tabla que tengan marcado el </w:t>
-      </w:r>
-      <w:proofErr w:type="spellStart"/>
-      <w:r>
-        <w:t>check</w:t>
-      </w:r>
-      <w:proofErr w:type="spellEnd"/>
-      <w:r>
-        <w:t>.</w:t>
+        <w:t>Cuando se guarda el albarán de venta, se suman los costes indicados en esta tabla que tengan marcado el check.</w:t>
       </w:r>
     </w:p>
     <w:p>
@@ -116,7 +103,13 @@
         </w:tabs>
       </w:pPr>
       <w:r>
-        <w:t>Este importe, se divide entre el número de unidades de todas las líneas del albarán, para obtener el coste por unidad que hay que sumar a la línea.</w:t>
+        <w:t>Este importe, se divide entre el número de unidades de todas las líneas del albarán</w:t>
+      </w:r>
+      <w:r>
+        <w:t xml:space="preserve"> que no tengan indicado el coste manual</w:t>
+      </w:r>
+      <w:r>
+        <w:t>, para obtener el coste por unidad que hay que sumar a la línea.</w:t>
       </w:r>
     </w:p>
     <w:p>
@@ -126,15 +119,7 @@
         </w:tabs>
       </w:pPr>
       <w:r>
-        <w:t xml:space="preserve">Posteriormente, para todas las líneas que no tenga obtención de coste manual, se suma este importe por unidad multiplicado por las unidades de la línea al coste que calcula </w:t>
-      </w:r>
-      <w:proofErr w:type="spellStart"/>
-      <w:r>
-        <w:t>nax</w:t>
-      </w:r>
-      <w:proofErr w:type="spellEnd"/>
-      <w:r>
-        <w:t xml:space="preserve"> para esa línea.</w:t>
+        <w:t>Posteriormente, para todas las líneas que no tenga obtención de coste manual, se suma este importe por unidad multiplicado por las unidades de la línea al coste que calcula nax para esa línea.</w:t>
       </w:r>
     </w:p>
     <w:p>
@@ -144,15 +129,7 @@
         </w:tabs>
       </w:pPr>
       <w:r>
-        <w:t xml:space="preserve">Este precio de coste de cálculo de </w:t>
-      </w:r>
-      <w:proofErr w:type="spellStart"/>
-      <w:r>
-        <w:t>Nax</w:t>
-      </w:r>
-      <w:proofErr w:type="spellEnd"/>
-      <w:r>
-        <w:t xml:space="preserve"> se recalcula siempre antes de sumar los costes adicionales, para que en las modificaciones no se sume al coste ya grabado en la línea, sino que se vuelva a realizar el cálculo, sino, se sumarian varias veces los costea adicionales, una vez por cada grabado del documento que hiciéramos.</w:t>
+        <w:t>Este precio de coste de cálculo de Nax se recalcula siempre antes de sumar los costes adicionales, para que en las modificaciones no se sume al coste ya grabado en la línea, sino que se vuelva a realizar el cálculo, sino, se sumarian varias veces los costea adicionales, una vez por cada grabado del documento que hiciéramos.</w:t>
       </w:r>
     </w:p>
     <w:p>
@@ -717,16 +694,8 @@
                             <w:rPr>
                               <w:b/>
                             </w:rPr>
-                            <w:t xml:space="preserve"> Costes adicionales. Funcionamiento de la </w:t>
+                            <w:t xml:space="preserve"> Costes adicionales. Funcionamiento de la dll</w:t>
                           </w:r>
-                          <w:proofErr w:type="spellStart"/>
-                          <w:r>
-                            <w:rPr>
-                              <w:b/>
-                            </w:rPr>
-                            <w:t>dll</w:t>
-                          </w:r>
-                          <w:proofErr w:type="spellEnd"/>
                         </w:p>
                       </w:txbxContent>
                     </wps:txbx>

</xml_diff>

<commit_message>
El coste es por unidad, que no multiplique por las unidades
</commit_message>
<xml_diff>
--- a/Docs/Solherbs – Costes adicionales. Funcionamiento de la dll.docx
+++ b/Docs/Solherbs – Costes adicionales. Funcionamiento de la dll.docx
@@ -83,7 +83,15 @@
         </w:tabs>
       </w:pPr>
       <w:r>
-        <w:t>Estos costes pueden ser sumados los costes de las líneas del albarán, o no, dependiendo de si está marcado el check de sumar o no.</w:t>
+        <w:t xml:space="preserve">Estos costes pueden ser sumados los costes de las líneas del albarán, o no, dependiendo de si está marcado el </w:t>
+      </w:r>
+      <w:proofErr w:type="spellStart"/>
+      <w:r>
+        <w:t>check</w:t>
+      </w:r>
+      <w:proofErr w:type="spellEnd"/>
+      <w:r>
+        <w:t xml:space="preserve"> de sumar o no.</w:t>
       </w:r>
     </w:p>
     <w:p>
@@ -93,7 +101,15 @@
         </w:tabs>
       </w:pPr>
       <w:r>
-        <w:t>Cuando se guarda el albarán de venta, se suman los costes indicados en esta tabla que tengan marcado el check.</w:t>
+        <w:t xml:space="preserve">Cuando se guarda el albarán de venta, se suman los costes indicados en esta tabla que tengan marcado el </w:t>
+      </w:r>
+      <w:proofErr w:type="spellStart"/>
+      <w:r>
+        <w:t>check</w:t>
+      </w:r>
+      <w:proofErr w:type="spellEnd"/>
+      <w:r>
+        <w:t>.</w:t>
       </w:r>
     </w:p>
     <w:p>
@@ -119,7 +135,15 @@
         </w:tabs>
       </w:pPr>
       <w:r>
-        <w:t>Posteriormente, para todas las líneas que no tenga obtención de coste manual, se suma este importe por unidad multiplicado por las unidades de la línea al coste que calcula nax para esa línea.</w:t>
+        <w:t xml:space="preserve">Posteriormente, para todas las líneas que no tenga obtención de coste manual, se suma este importe por unidad al coste que calcula </w:t>
+      </w:r>
+      <w:proofErr w:type="spellStart"/>
+      <w:r>
+        <w:t>nax</w:t>
+      </w:r>
+      <w:proofErr w:type="spellEnd"/>
+      <w:r>
+        <w:t xml:space="preserve"> para esa línea.</w:t>
       </w:r>
     </w:p>
     <w:p>
@@ -129,7 +153,15 @@
         </w:tabs>
       </w:pPr>
       <w:r>
-        <w:t>Este precio de coste de cálculo de Nax se recalcula siempre antes de sumar los costes adicionales, para que en las modificaciones no se sume al coste ya grabado en la línea, sino que se vuelva a realizar el cálculo, sino, se sumarian varias veces los costea adicionales, una vez por cada grabado del documento que hiciéramos.</w:t>
+        <w:t xml:space="preserve">Este precio de coste de cálculo de </w:t>
+      </w:r>
+      <w:proofErr w:type="spellStart"/>
+      <w:r>
+        <w:t>Nax</w:t>
+      </w:r>
+      <w:proofErr w:type="spellEnd"/>
+      <w:r>
+        <w:t xml:space="preserve"> se recalcula siempre antes de sumar los costes adicionales, para que en las modificaciones no se sume al coste ya grabado en la línea, sino que se vuelva a realizar el cálculo, sino, se sumarian varias veces los costea adicionales, una vez por cada grabado del documento que hiciéramos.</w:t>
       </w:r>
     </w:p>
     <w:p>
@@ -694,8 +726,16 @@
                             <w:rPr>
                               <w:b/>
                             </w:rPr>
-                            <w:t xml:space="preserve"> Costes adicionales. Funcionamiento de la dll</w:t>
+                            <w:t xml:space="preserve"> Costes adicionales. Funcionamiento de la </w:t>
                           </w:r>
+                          <w:proofErr w:type="spellStart"/>
+                          <w:r>
+                            <w:rPr>
+                              <w:b/>
+                            </w:rPr>
+                            <w:t>dll</w:t>
+                          </w:r>
+                          <w:proofErr w:type="spellEnd"/>
                         </w:p>
                       </w:txbxContent>
                     </wps:txbx>

</xml_diff>

<commit_message>
Configurar si se aplica en lineas con obtencion de coste manual o no
</commit_message>
<xml_diff>
--- a/Docs/Solherbs – Costes adicionales. Funcionamiento de la dll.docx
+++ b/Docs/Solherbs – Costes adicionales. Funcionamiento de la dll.docx
@@ -125,6 +125,14 @@
         <w:t xml:space="preserve"> que no tengan indicado el coste manual</w:t>
       </w:r>
       <w:r>
+        <w:t xml:space="preserve"> o , de todas, en el caso de que así se haya indicado en la </w:t>
+      </w:r>
+      <w:proofErr w:type="spellStart"/>
+      <w:r>
+        <w:t>configuracion</w:t>
+      </w:r>
+      <w:proofErr w:type="spellEnd"/>
+      <w:r>
         <w:t>, para obtener el coste por unidad que hay que sumar a la línea.</w:t>
       </w:r>
     </w:p>
@@ -135,7 +143,30 @@
         </w:tabs>
       </w:pPr>
       <w:r>
-        <w:t xml:space="preserve">Posteriormente, para todas las líneas que no tenga obtención de coste manual, se suma este importe por unidad al coste que calcula </w:t>
+        <w:t>Posteriormente, para todas las líneas que no tenga obtención de coste manual</w:t>
+      </w:r>
+      <w:r>
+        <w:t xml:space="preserve"> o</w:t>
+      </w:r>
+      <w:r>
+        <w:t xml:space="preserve"> </w:t>
+      </w:r>
+      <w:r>
+        <w:t xml:space="preserve">, </w:t>
+      </w:r>
+      <w:r>
+        <w:t xml:space="preserve">para </w:t>
+      </w:r>
+      <w:r>
+        <w:t xml:space="preserve">todas, en el caso de que así se haya indicado en la </w:t>
+      </w:r>
+      <w:proofErr w:type="spellStart"/>
+      <w:r>
+        <w:t>configuracion</w:t>
+      </w:r>
+      <w:proofErr w:type="spellEnd"/>
+      <w:r>
+        <w:t xml:space="preserve">, se suma este importe por unidad al coste que calcula </w:t>
       </w:r>
       <w:proofErr w:type="spellStart"/>
       <w:r>

</xml_diff>

<commit_message>
Version 1.1 - Parametrizable en cabecera para que no calcule nada de los costes
</commit_message>
<xml_diff>
--- a/Docs/Solherbs – Costes adicionales. Funcionamiento de la dll.docx
+++ b/Docs/Solherbs – Costes adicionales. Funcionamiento de la dll.docx
@@ -125,7 +125,15 @@
         <w:t xml:space="preserve"> que no tengan indicado el coste manual</w:t>
       </w:r>
       <w:r>
-        <w:t xml:space="preserve"> o , de todas, en el caso de que así se haya indicado en la </w:t>
+        <w:t xml:space="preserve"> </w:t>
+      </w:r>
+      <w:proofErr w:type="gramStart"/>
+      <w:r>
+        <w:t>o ,</w:t>
+      </w:r>
+      <w:proofErr w:type="gramEnd"/>
+      <w:r>
+        <w:t xml:space="preserve"> de todas, en el caso de que así se haya indicado en la </w:t>
       </w:r>
       <w:proofErr w:type="spellStart"/>
       <w:r>
@@ -146,19 +154,21 @@
         <w:t>Posteriormente, para todas las líneas que no tenga obtención de coste manual</w:t>
       </w:r>
       <w:r>
-        <w:t xml:space="preserve"> o</w:t>
+        <w:t xml:space="preserve"> </w:t>
+      </w:r>
+      <w:proofErr w:type="gramStart"/>
+      <w:r>
+        <w:t>o</w:t>
       </w:r>
       <w:r>
         <w:t xml:space="preserve"> </w:t>
       </w:r>
       <w:r>
-        <w:t xml:space="preserve">, </w:t>
+        <w:t>,</w:t>
       </w:r>
+      <w:proofErr w:type="gramEnd"/>
       <w:r>
-        <w:t xml:space="preserve">para </w:t>
-      </w:r>
-      <w:r>
-        <w:t xml:space="preserve">todas, en el caso de que así se haya indicado en la </w:t>
+        <w:t xml:space="preserve"> para todas, en el caso de que así se haya indicado en la </w:t>
       </w:r>
       <w:proofErr w:type="spellStart"/>
       <w:r>
@@ -203,6 +213,40 @@
       </w:pPr>
       <w:r>
         <w:t>Esto hay que tenerlo en cuenta, porque será el coste que tenga en la última modificación del albarán.</w:t>
+      </w:r>
+    </w:p>
+    <w:p>
+      <w:pPr>
+        <w:tabs>
+          <w:tab w:val="left" w:pos="7395"/>
+        </w:tabs>
+      </w:pPr>
+      <w:r>
+        <w:t xml:space="preserve">Importante: </w:t>
+      </w:r>
+      <w:r>
+        <w:t>Si en el parametrizable de la cabecera indicado en la configuración se indica T, no se realizará ninguno de los cálculos de los costes.</w:t>
+      </w:r>
+    </w:p>
+    <w:p>
+      <w:pPr>
+        <w:tabs>
+          <w:tab w:val="left" w:pos="7395"/>
+        </w:tabs>
+      </w:pPr>
+    </w:p>
+    <w:p/>
+    <w:p/>
+    <w:p/>
+    <w:p/>
+    <w:p>
+      <w:pPr>
+        <w:tabs>
+          <w:tab w:val="left" w:pos="7476"/>
+        </w:tabs>
+      </w:pPr>
+      <w:r>
+        <w:tab/>
       </w:r>
     </w:p>
     <w:sectPr>
@@ -560,13 +604,13 @@
       <w:t xml:space="preserve"> Fecha de Redacción </w:t>
     </w:r>
     <w:r>
-      <w:t>11</w:t>
+      <w:t>13</w:t>
     </w:r>
     <w:r>
       <w:t>/</w:t>
     </w:r>
     <w:r>
-      <w:t>02</w:t>
+      <w:t>04</w:t>
     </w:r>
     <w:r>
       <w:t>/</w:t>
@@ -767,6 +811,26 @@
                             <w:t>dll</w:t>
                           </w:r>
                           <w:proofErr w:type="spellEnd"/>
+                          <w:r>
+                            <w:rPr>
+                              <w:b/>
+                            </w:rPr>
+                            <w:t xml:space="preserve">. </w:t>
+                          </w:r>
+                          <w:proofErr w:type="spellStart"/>
+                          <w:r>
+                            <w:rPr>
+                              <w:b/>
+                            </w:rPr>
+                            <w:t>Version</w:t>
+                          </w:r>
+                          <w:proofErr w:type="spellEnd"/>
+                          <w:r>
+                            <w:rPr>
+                              <w:b/>
+                            </w:rPr>
+                            <w:t xml:space="preserve"> 1.1</w:t>
+                          </w:r>
                         </w:p>
                       </w:txbxContent>
                     </wps:txbx>
@@ -834,6 +898,26 @@
                       <w:t>dll</w:t>
                     </w:r>
                     <w:proofErr w:type="spellEnd"/>
+                    <w:r>
+                      <w:rPr>
+                        <w:b/>
+                      </w:rPr>
+                      <w:t xml:space="preserve">. </w:t>
+                    </w:r>
+                    <w:proofErr w:type="spellStart"/>
+                    <w:r>
+                      <w:rPr>
+                        <w:b/>
+                      </w:rPr>
+                      <w:t>Version</w:t>
+                    </w:r>
+                    <w:proofErr w:type="spellEnd"/>
+                    <w:r>
+                      <w:rPr>
+                        <w:b/>
+                      </w:rPr>
+                      <w:t xml:space="preserve"> 1.1</w:t>
+                    </w:r>
                   </w:p>
                 </w:txbxContent>
               </v:textbox>

</xml_diff>